<commit_message>
Improve formatting: legible flowcharts, clean cover, page numbering
Co-Authored-By: Claude Sonnet 5.5 <noreply@anthropic.com>
Claude-Session: https://claude.ai/code/session_01JeLfMYGDb9EwkUA8C7rQ81
</commit_message>
<xml_diff>
--- a/docs/entregas/Documentacao_Novo_Sistema_SLA_Itau.docx
+++ b/docs/entregas/Documentacao_Novo_Sistema_SLA_Itau.docx
@@ -4,12 +4,12 @@
   <w:body>
     <w:p>
       <w:pPr>
-        <w:spacing w:before="1400"/>
+        <w:spacing w:before="900"/>
       </w:pPr>
     </w:p>
     <w:p>
       <w:pPr>
-        <w:spacing w:after="600"/>
+        <w:spacing w:after="300"/>
       </w:pPr>
       <w:r>
         <w:rPr>
@@ -17,10 +17,26 @@
           <w:b/>
           <w:bCs/>
           <w:color w:val="2F6DB5"/>
-          <w:sz w:val="26"/>
-          <w:szCs w:val="26"/>
+          <w:sz w:val="30"/>
+          <w:szCs w:val="30"/>
         </w:rPr>
         <w:t xml:space="preserve">N1 IT | Grupo Stefanini</w:t>
+      </w:r>
+    </w:p>
+    <w:p>
+      <w:pPr>
+        <w:spacing w:after="500"/>
+      </w:pPr>
+      <w:r>
+        <w:rPr>
+          <w:rFonts w:ascii="Arial" w:cs="Arial" w:eastAsia="Arial" w:hAnsi="Arial"/>
+          <w:b w:val="false"/>
+          <w:bCs w:val="false"/>
+          <w:color w:val="666666"/>
+          <w:sz w:val="18"/>
+          <w:szCs w:val="18"/>
+        </w:rPr>
+        <w:t xml:space="preserve">Grupo Stefanini · Documento corporativo</w:t>
       </w:r>
     </w:p>
     <w:p>
@@ -33,7 +49,7 @@
     </w:p>
     <w:p>
       <w:pPr>
-        <w:spacing w:after="200"/>
+        <w:spacing w:after="240"/>
       </w:pPr>
       <w:r>
         <w:rPr>
@@ -41,15 +57,15 @@
           <w:b/>
           <w:bCs/>
           <w:color w:val="0B2A4A"/>
-          <w:sz w:val="52"/>
-          <w:szCs w:val="52"/>
+          <w:sz w:val="56"/>
+          <w:szCs w:val="56"/>
         </w:rPr>
         <w:t xml:space="preserve">Novo Sistema de Gestão e Medição de Serviços (SLA)</w:t>
       </w:r>
     </w:p>
     <w:p>
       <w:pPr>
-        <w:spacing w:after="700"/>
+        <w:spacing w:after="900"/>
       </w:pPr>
       <w:r>
         <w:rPr>
@@ -2507,7 +2523,8 @@
         </w:trPr>
         <w:tc>
           <w:tcPr>
-            <w:tcW w:type="dxa" w:w="3000"/>
+            <w:tcW w:type="dxa" w:w="9638"/>
+            <w:gridSpan w:val="2"/>
             <w:tcBorders>
               <w:top w:val="single" w:color="BFC5CE" w:sz="4"/>
               <w:left w:val="single" w:color="BFC5CE" w:sz="4"/>
@@ -2532,34 +2549,11 @@
                 <w:b/>
                 <w:bCs/>
                 <w:color w:val="FFFFFF"/>
-                <w:sz w:val="18"/>
-                <w:szCs w:val="18"/>
+                <w:sz w:val="20"/>
+                <w:szCs w:val="20"/>
               </w:rPr>
               <w:t xml:space="preserve">Quadro-resumo</w:t>
             </w:r>
-          </w:p>
-        </w:tc>
-        <w:tc>
-          <w:tcPr>
-            <w:tcW w:type="dxa" w:w="6638"/>
-            <w:tcBorders>
-              <w:top w:val="single" w:color="BFC5CE" w:sz="4"/>
-              <w:left w:val="single" w:color="BFC5CE" w:sz="4"/>
-              <w:bottom w:val="single" w:color="BFC5CE" w:sz="4"/>
-              <w:right w:val="single" w:color="BFC5CE" w:sz="4"/>
-            </w:tcBorders>
-            <w:shd w:fill="0B2A4A" w:color="auto" w:val="clear"/>
-            <w:tcMar>
-              <w:top w:type="dxa" w:w="60"/>
-              <w:left w:type="dxa" w:w="90"/>
-              <w:bottom w:type="dxa" w:w="60"/>
-              <w:right w:type="dxa" w:w="90"/>
-            </w:tcMar>
-          </w:tcPr>
-          <w:p>
-            <w:pPr>
-              <w:spacing w:after="50" w:line="250"/>
-            </w:pPr>
           </w:p>
         </w:tc>
       </w:tr>
@@ -6311,8 +6305,8 @@
                 <w:rFonts w:ascii="Arial" w:cs="Arial" w:eastAsia="Arial" w:hAnsi="Arial"/>
                 <w:b/>
                 <w:bCs/>
-                <w:sz w:val="17"/>
-                <w:szCs w:val="17"/>
+                <w:sz w:val="16"/>
+                <w:szCs w:val="16"/>
               </w:rPr>
               <w:t xml:space="preserve">Pedido de acesso</w:t>
             </w:r>
@@ -6343,8 +6337,8 @@
                 <w:rFonts w:ascii="Arial" w:cs="Arial" w:eastAsia="Arial" w:hAnsi="Arial"/>
                 <w:b w:val="false"/>
                 <w:bCs w:val="false"/>
-                <w:sz w:val="17"/>
-                <w:szCs w:val="17"/>
+                <w:sz w:val="16"/>
+                <w:szCs w:val="16"/>
               </w:rPr>
               <w:t xml:space="preserve">Formulário fora do sistema; um ponto focal cadastra o pedido.</w:t>
             </w:r>
@@ -6375,8 +6369,8 @@
                 <w:rFonts w:ascii="Arial" w:cs="Arial" w:eastAsia="Arial" w:hAnsi="Arial"/>
                 <w:b w:val="false"/>
                 <w:bCs w:val="false"/>
-                <w:sz w:val="17"/>
-                <w:szCs w:val="17"/>
+                <w:sz w:val="16"/>
+                <w:szCs w:val="16"/>
               </w:rPr>
               <w:t xml:space="preserve">Pedido feito no próprio sistema, com aprovação do gestor e histórico (V10).</w:t>
             </w:r>
@@ -6407,8 +6401,8 @@
                 <w:rFonts w:ascii="Arial" w:cs="Arial" w:eastAsia="Arial" w:hAnsi="Arial"/>
                 <w:b w:val="false"/>
                 <w:bCs w:val="false"/>
-                <w:sz w:val="17"/>
-                <w:szCs w:val="17"/>
+                <w:sz w:val="16"/>
+                <w:szCs w:val="16"/>
               </w:rPr>
               <w:t xml:space="preserve">Menos etapas e acesso rastreável.</w:t>
             </w:r>
@@ -6445,8 +6439,8 @@
                 <w:rFonts w:ascii="Arial" w:cs="Arial" w:eastAsia="Arial" w:hAnsi="Arial"/>
                 <w:b/>
                 <w:bCs/>
-                <w:sz w:val="17"/>
-                <w:szCs w:val="17"/>
+                <w:sz w:val="16"/>
+                <w:szCs w:val="16"/>
               </w:rPr>
               <w:t xml:space="preserve">Cadastros (polos, itens, fornecedores)</w:t>
             </w:r>
@@ -6478,8 +6472,8 @@
                 <w:rFonts w:ascii="Arial" w:cs="Arial" w:eastAsia="Arial" w:hAnsi="Arial"/>
                 <w:b w:val="false"/>
                 <w:bCs w:val="false"/>
-                <w:sz w:val="17"/>
-                <w:szCs w:val="17"/>
+                <w:sz w:val="16"/>
+                <w:szCs w:val="16"/>
               </w:rPr>
               <w:t xml:space="preserve">Cadastros em vários lugares. Erro de grafia impede cargas.</w:t>
             </w:r>
@@ -6511,8 +6505,8 @@
                 <w:rFonts w:ascii="Arial" w:cs="Arial" w:eastAsia="Arial" w:hAnsi="Arial"/>
                 <w:b w:val="false"/>
                 <w:bCs w:val="false"/>
-                <w:sz w:val="17"/>
-                <w:szCs w:val="17"/>
+                <w:sz w:val="16"/>
+                <w:szCs w:val="16"/>
               </w:rPr>
               <w:t xml:space="preserve">Listas controladas, validação antes de salvar e carga em lote assistida (V13, V15).</w:t>
             </w:r>
@@ -6544,8 +6538,8 @@
                 <w:rFonts w:ascii="Arial" w:cs="Arial" w:eastAsia="Arial" w:hAnsi="Arial"/>
                 <w:b w:val="false"/>
                 <w:bCs w:val="false"/>
-                <w:sz w:val="17"/>
-                <w:szCs w:val="17"/>
+                <w:sz w:val="16"/>
+                <w:szCs w:val="16"/>
               </w:rPr>
               <w:t xml:space="preserve">Menos retrabalho e dados padronizados.</w:t>
             </w:r>
@@ -6582,8 +6576,8 @@
                 <w:rFonts w:ascii="Arial" w:cs="Arial" w:eastAsia="Arial" w:hAnsi="Arial"/>
                 <w:b/>
                 <w:bCs/>
-                <w:sz w:val="17"/>
-                <w:szCs w:val="17"/>
+                <w:sz w:val="16"/>
+                <w:szCs w:val="16"/>
               </w:rPr>
               <w:t xml:space="preserve">Abertura da ocorrência</w:t>
             </w:r>
@@ -6614,8 +6608,8 @@
                 <w:rFonts w:ascii="Arial" w:cs="Arial" w:eastAsia="Arial" w:hAnsi="Arial"/>
                 <w:b w:val="false"/>
                 <w:bCs w:val="false"/>
-                <w:sz w:val="17"/>
-                <w:szCs w:val="17"/>
+                <w:sz w:val="16"/>
+                <w:szCs w:val="16"/>
               </w:rPr>
               <w:t xml:space="preserve">Pessoa preenche; sessão cai em 30 minutos sem aviso e perde o texto.</w:t>
             </w:r>
@@ -6646,8 +6640,8 @@
                 <w:rFonts w:ascii="Arial" w:cs="Arial" w:eastAsia="Arial" w:hAnsi="Arial"/>
                 <w:b w:val="false"/>
                 <w:bCs w:val="false"/>
-                <w:sz w:val="17"/>
-                <w:szCs w:val="17"/>
+                <w:sz w:val="16"/>
+                <w:szCs w:val="16"/>
               </w:rPr>
               <w:t xml:space="preserve">Rascunho automático, aviso antes de expirar e campos obrigatórios claros (V24).</w:t>
             </w:r>
@@ -6678,8 +6672,8 @@
                 <w:rFonts w:ascii="Arial" w:cs="Arial" w:eastAsia="Arial" w:hAnsi="Arial"/>
                 <w:b w:val="false"/>
                 <w:bCs w:val="false"/>
-                <w:sz w:val="17"/>
-                <w:szCs w:val="17"/>
+                <w:sz w:val="16"/>
+                <w:szCs w:val="16"/>
               </w:rPr>
               <w:t xml:space="preserve">Nenhum preenchimento perdido.</w:t>
             </w:r>
@@ -6716,8 +6710,8 @@
                 <w:rFonts w:ascii="Arial" w:cs="Arial" w:eastAsia="Arial" w:hAnsi="Arial"/>
                 <w:b/>
                 <w:bCs/>
-                <w:sz w:val="17"/>
-                <w:szCs w:val="17"/>
+                <w:sz w:val="16"/>
+                <w:szCs w:val="16"/>
               </w:rPr>
               <w:t xml:space="preserve">Notificação ao fornecedor</w:t>
             </w:r>
@@ -6749,8 +6743,8 @@
                 <w:rFonts w:ascii="Arial" w:cs="Arial" w:eastAsia="Arial" w:hAnsi="Arial"/>
                 <w:b w:val="false"/>
                 <w:bCs w:val="false"/>
-                <w:sz w:val="17"/>
-                <w:szCs w:val="17"/>
+                <w:sz w:val="16"/>
+                <w:szCs w:val="16"/>
               </w:rPr>
               <w:t xml:space="preserve">Robô envia e-mail; pode falhar sem erro. Itaú avisa manualmente e controla em planilha.</w:t>
             </w:r>
@@ -6782,8 +6776,8 @@
                 <w:rFonts w:ascii="Arial" w:cs="Arial" w:eastAsia="Arial" w:hAnsi="Arial"/>
                 <w:b w:val="false"/>
                 <w:bCs w:val="false"/>
-                <w:sz w:val="17"/>
-                <w:szCs w:val="17"/>
+                <w:sz w:val="16"/>
+                <w:szCs w:val="16"/>
               </w:rPr>
               <w:t xml:space="preserve">Status do envio, reenvio automático (até 3 vezes) e alerta ao responsável (V6).</w:t>
             </w:r>
@@ -6815,8 +6809,8 @@
                 <w:rFonts w:ascii="Arial" w:cs="Arial" w:eastAsia="Arial" w:hAnsi="Arial"/>
                 <w:b w:val="false"/>
                 <w:bCs w:val="false"/>
-                <w:sz w:val="17"/>
-                <w:szCs w:val="17"/>
+                <w:sz w:val="16"/>
+                <w:szCs w:val="16"/>
               </w:rPr>
               <w:t xml:space="preserve">Fornecedor sempre avisado, com prova.</w:t>
             </w:r>
@@ -6853,8 +6847,8 @@
                 <w:rFonts w:ascii="Arial" w:cs="Arial" w:eastAsia="Arial" w:hAnsi="Arial"/>
                 <w:b/>
                 <w:bCs/>
-                <w:sz w:val="17"/>
-                <w:szCs w:val="17"/>
+                <w:sz w:val="16"/>
+                <w:szCs w:val="16"/>
               </w:rPr>
               <w:t xml:space="preserve">Correção de fornecedor</w:t>
             </w:r>
@@ -6885,8 +6879,8 @@
                 <w:rFonts w:ascii="Arial" w:cs="Arial" w:eastAsia="Arial" w:hAnsi="Arial"/>
                 <w:b w:val="false"/>
                 <w:bCs w:val="false"/>
-                <w:sz w:val="17"/>
-                <w:szCs w:val="17"/>
+                <w:sz w:val="16"/>
+                <w:szCs w:val="16"/>
               </w:rPr>
               <w:t xml:space="preserve">Corrigir não reenvia o aviso. É preciso encerrar e abrir outra ocorrência.</w:t>
             </w:r>
@@ -6917,8 +6911,8 @@
                 <w:rFonts w:ascii="Arial" w:cs="Arial" w:eastAsia="Arial" w:hAnsi="Arial"/>
                 <w:b w:val="false"/>
                 <w:bCs w:val="false"/>
-                <w:sz w:val="17"/>
-                <w:szCs w:val="17"/>
+                <w:sz w:val="16"/>
+                <w:szCs w:val="16"/>
               </w:rPr>
               <w:t xml:space="preserve">Correção com reenvio controlado e aviso de desconsideração ao fornecedor anterior (V8).</w:t>
             </w:r>
@@ -6949,8 +6943,8 @@
                 <w:rFonts w:ascii="Arial" w:cs="Arial" w:eastAsia="Arial" w:hAnsi="Arial"/>
                 <w:b w:val="false"/>
                 <w:bCs w:val="false"/>
-                <w:sz w:val="17"/>
-                <w:szCs w:val="17"/>
+                <w:sz w:val="16"/>
+                <w:szCs w:val="16"/>
               </w:rPr>
               <w:t xml:space="preserve">Menos ocorrências duplicadas.</w:t>
             </w:r>
@@ -6987,8 +6981,8 @@
                 <w:rFonts w:ascii="Arial" w:cs="Arial" w:eastAsia="Arial" w:hAnsi="Arial"/>
                 <w:b/>
                 <w:bCs/>
-                <w:sz w:val="17"/>
-                <w:szCs w:val="17"/>
+                <w:sz w:val="16"/>
+                <w:szCs w:val="16"/>
               </w:rPr>
               <w:t xml:space="preserve">Acompanhamento</w:t>
             </w:r>
@@ -7020,8 +7014,8 @@
                 <w:rFonts w:ascii="Arial" w:cs="Arial" w:eastAsia="Arial" w:hAnsi="Arial"/>
                 <w:b w:val="false"/>
                 <w:bCs w:val="false"/>
-                <w:sz w:val="17"/>
-                <w:szCs w:val="17"/>
+                <w:sz w:val="16"/>
+                <w:szCs w:val="16"/>
               </w:rPr>
               <w:t xml:space="preserve">Sem lembretes efetivos. Ocorrências abertas ficam esquecidas.</w:t>
             </w:r>
@@ -7053,8 +7047,8 @@
                 <w:rFonts w:ascii="Arial" w:cs="Arial" w:eastAsia="Arial" w:hAnsi="Arial"/>
                 <w:b w:val="false"/>
                 <w:bCs w:val="false"/>
-                <w:sz w:val="17"/>
-                <w:szCs w:val="17"/>
+                <w:sz w:val="16"/>
+                <w:szCs w:val="16"/>
               </w:rPr>
               <w:t xml:space="preserve">Lembretes por e-mail e painel de ocorrências abertas e vencidas (V1, V4).</w:t>
             </w:r>
@@ -7086,8 +7080,8 @@
                 <w:rFonts w:ascii="Arial" w:cs="Arial" w:eastAsia="Arial" w:hAnsi="Arial"/>
                 <w:b w:val="false"/>
                 <w:bCs w:val="false"/>
-                <w:sz w:val="17"/>
-                <w:szCs w:val="17"/>
+                <w:sz w:val="16"/>
+                <w:szCs w:val="16"/>
               </w:rPr>
               <w:t xml:space="preserve">Nada fica parado sem ninguém ver.</w:t>
             </w:r>
@@ -7124,8 +7118,8 @@
                 <w:rFonts w:ascii="Arial" w:cs="Arial" w:eastAsia="Arial" w:hAnsi="Arial"/>
                 <w:b/>
                 <w:bCs/>
-                <w:sz w:val="17"/>
-                <w:szCs w:val="17"/>
+                <w:sz w:val="16"/>
+                <w:szCs w:val="16"/>
               </w:rPr>
               <w:t xml:space="preserve">Encerramento</w:t>
             </w:r>
@@ -7156,8 +7150,8 @@
                 <w:rFonts w:ascii="Arial" w:cs="Arial" w:eastAsia="Arial" w:hAnsi="Arial"/>
                 <w:b w:val="false"/>
                 <w:bCs w:val="false"/>
-                <w:sz w:val="17"/>
-                <w:szCs w:val="17"/>
+                <w:sz w:val="16"/>
+                <w:szCs w:val="16"/>
               </w:rPr>
               <w:t xml:space="preserve">Pode encerrar sem motivo ou evidência.</w:t>
             </w:r>
@@ -7188,8 +7182,8 @@
                 <w:rFonts w:ascii="Arial" w:cs="Arial" w:eastAsia="Arial" w:hAnsi="Arial"/>
                 <w:b w:val="false"/>
                 <w:bCs w:val="false"/>
-                <w:sz w:val="17"/>
-                <w:szCs w:val="17"/>
+                <w:sz w:val="16"/>
+                <w:szCs w:val="16"/>
               </w:rPr>
               <w:t xml:space="preserve">Motivo, evidência, responsável e data obrigatórios (V2).</w:t>
             </w:r>
@@ -7220,8 +7214,8 @@
                 <w:rFonts w:ascii="Arial" w:cs="Arial" w:eastAsia="Arial" w:hAnsi="Arial"/>
                 <w:b w:val="false"/>
                 <w:bCs w:val="false"/>
-                <w:sz w:val="17"/>
-                <w:szCs w:val="17"/>
+                <w:sz w:val="16"/>
+                <w:szCs w:val="16"/>
               </w:rPr>
               <w:t xml:space="preserve">Histórico claro e confiável.</w:t>
             </w:r>
@@ -7258,8 +7252,8 @@
                 <w:rFonts w:ascii="Arial" w:cs="Arial" w:eastAsia="Arial" w:hAnsi="Arial"/>
                 <w:b/>
                 <w:bCs/>
-                <w:sz w:val="17"/>
-                <w:szCs w:val="17"/>
+                <w:sz w:val="16"/>
+                <w:szCs w:val="16"/>
               </w:rPr>
               <w:t xml:space="preserve">Permissões</w:t>
             </w:r>
@@ -7291,8 +7285,8 @@
                 <w:rFonts w:ascii="Arial" w:cs="Arial" w:eastAsia="Arial" w:hAnsi="Arial"/>
                 <w:b w:val="false"/>
                 <w:bCs w:val="false"/>
-                <w:sz w:val="17"/>
-                <w:szCs w:val="17"/>
+                <w:sz w:val="16"/>
+                <w:szCs w:val="16"/>
               </w:rPr>
               <w:t xml:space="preserve">Perfis amplos: quem tem permissão edita ou fecha ocorrência de outra pessoa.</w:t>
             </w:r>
@@ -7324,8 +7318,8 @@
                 <w:rFonts w:ascii="Arial" w:cs="Arial" w:eastAsia="Arial" w:hAnsi="Arial"/>
                 <w:b w:val="false"/>
                 <w:bCs w:val="false"/>
-                <w:sz w:val="17"/>
-                <w:szCs w:val="17"/>
+                <w:sz w:val="16"/>
+                <w:szCs w:val="16"/>
               </w:rPr>
               <w:t xml:space="preserve">Edição e encerramento por responsável, com justificativa nas exceções (V11).</w:t>
             </w:r>
@@ -7357,8 +7351,8 @@
                 <w:rFonts w:ascii="Arial" w:cs="Arial" w:eastAsia="Arial" w:hAnsi="Arial"/>
                 <w:b w:val="false"/>
                 <w:bCs w:val="false"/>
-                <w:sz w:val="17"/>
-                <w:szCs w:val="17"/>
+                <w:sz w:val="16"/>
+                <w:szCs w:val="16"/>
               </w:rPr>
               <w:t xml:space="preserve">Menos alteração indevida.</w:t>
             </w:r>
@@ -7395,8 +7389,8 @@
                 <w:rFonts w:ascii="Arial" w:cs="Arial" w:eastAsia="Arial" w:hAnsi="Arial"/>
                 <w:b/>
                 <w:bCs/>
-                <w:sz w:val="17"/>
-                <w:szCs w:val="17"/>
+                <w:sz w:val="16"/>
+                <w:szCs w:val="16"/>
               </w:rPr>
               <w:t xml:space="preserve">Consulta e filtros</w:t>
             </w:r>
@@ -7427,8 +7421,8 @@
                 <w:rFonts w:ascii="Arial" w:cs="Arial" w:eastAsia="Arial" w:hAnsi="Arial"/>
                 <w:b w:val="false"/>
                 <w:bCs w:val="false"/>
-                <w:sz w:val="17"/>
-                <w:szCs w:val="17"/>
+                <w:sz w:val="16"/>
+                <w:szCs w:val="16"/>
               </w:rPr>
               <w:t xml:space="preserve">Telas lentas; faltam filtros por período, código, prédio e outros.</w:t>
             </w:r>
@@ -7459,8 +7453,8 @@
                 <w:rFonts w:ascii="Arial" w:cs="Arial" w:eastAsia="Arial" w:hAnsi="Arial"/>
                 <w:b w:val="false"/>
                 <w:bCs w:val="false"/>
-                <w:sz w:val="17"/>
-                <w:szCs w:val="17"/>
+                <w:sz w:val="16"/>
+                <w:szCs w:val="16"/>
               </w:rPr>
               <w:t xml:space="preserve">Filtros por período, ID, polo, prédio, categoria, tipo, item, fornecedor, status e responsável, com paginação.</w:t>
             </w:r>
@@ -7491,8 +7485,8 @@
                 <w:rFonts w:ascii="Arial" w:cs="Arial" w:eastAsia="Arial" w:hAnsi="Arial"/>
                 <w:b w:val="false"/>
                 <w:bCs w:val="false"/>
-                <w:sz w:val="17"/>
-                <w:szCs w:val="17"/>
+                <w:sz w:val="16"/>
+                <w:szCs w:val="16"/>
               </w:rPr>
               <w:t xml:space="preserve">Resposta rápida e busca completa.</w:t>
             </w:r>
@@ -7529,8 +7523,8 @@
                 <w:rFonts w:ascii="Arial" w:cs="Arial" w:eastAsia="Arial" w:hAnsi="Arial"/>
                 <w:b/>
                 <w:bCs/>
-                <w:sz w:val="17"/>
-                <w:szCs w:val="17"/>
+                <w:sz w:val="16"/>
+                <w:szCs w:val="16"/>
               </w:rPr>
               <w:t xml:space="preserve">Histórico (log)</w:t>
             </w:r>
@@ -7562,8 +7556,8 @@
                 <w:rFonts w:ascii="Arial" w:cs="Arial" w:eastAsia="Arial" w:hAnsi="Arial"/>
                 <w:b w:val="false"/>
                 <w:bCs w:val="false"/>
-                <w:sz w:val="17"/>
-                <w:szCs w:val="17"/>
+                <w:sz w:val="16"/>
+                <w:szCs w:val="16"/>
               </w:rPr>
               <w:t xml:space="preserve">Existe, mas é técnico e difícil de ler.</w:t>
             </w:r>
@@ -7595,8 +7589,8 @@
                 <w:rFonts w:ascii="Arial" w:cs="Arial" w:eastAsia="Arial" w:hAnsi="Arial"/>
                 <w:b w:val="false"/>
                 <w:bCs w:val="false"/>
-                <w:sz w:val="17"/>
-                <w:szCs w:val="17"/>
+                <w:sz w:val="16"/>
+                <w:szCs w:val="16"/>
               </w:rPr>
               <w:t xml:space="preserve">Histórico em linguagem de negócio: quem, quando, o quê, antes e depois.</w:t>
             </w:r>
@@ -7628,8 +7622,8 @@
                 <w:rFonts w:ascii="Arial" w:cs="Arial" w:eastAsia="Arial" w:hAnsi="Arial"/>
                 <w:b w:val="false"/>
                 <w:bCs w:val="false"/>
-                <w:sz w:val="17"/>
-                <w:szCs w:val="17"/>
+                <w:sz w:val="16"/>
+                <w:szCs w:val="16"/>
               </w:rPr>
               <w:t xml:space="preserve">Auditoria acessível.</w:t>
             </w:r>
@@ -7666,8 +7660,8 @@
                 <w:rFonts w:ascii="Arial" w:cs="Arial" w:eastAsia="Arial" w:hAnsi="Arial"/>
                 <w:b/>
                 <w:bCs/>
-                <w:sz w:val="17"/>
-                <w:szCs w:val="17"/>
+                <w:sz w:val="16"/>
+                <w:szCs w:val="16"/>
               </w:rPr>
               <w:t xml:space="preserve">Medição e pontuação</w:t>
             </w:r>
@@ -7698,8 +7692,8 @@
                 <w:rFonts w:ascii="Arial" w:cs="Arial" w:eastAsia="Arial" w:hAnsi="Arial"/>
                 <w:b w:val="false"/>
                 <w:bCs w:val="false"/>
-                <w:sz w:val="17"/>
-                <w:szCs w:val="17"/>
+                <w:sz w:val="16"/>
+                <w:szCs w:val="16"/>
               </w:rPr>
               <w:t xml:space="preserve">Exportação para Excel, PROCV e tabela dinâmica.</w:t>
             </w:r>
@@ -7730,8 +7724,8 @@
                 <w:rFonts w:ascii="Arial" w:cs="Arial" w:eastAsia="Arial" w:hAnsi="Arial"/>
                 <w:b w:val="false"/>
                 <w:bCs w:val="false"/>
-                <w:sz w:val="17"/>
-                <w:szCs w:val="17"/>
+                <w:sz w:val="16"/>
+                <w:szCs w:val="16"/>
               </w:rPr>
               <w:t xml:space="preserve">Cálculo no sistema, com tabela de pontuação por contrato e vigência (V16, V17).</w:t>
             </w:r>
@@ -7762,8 +7756,8 @@
                 <w:rFonts w:ascii="Arial" w:cs="Arial" w:eastAsia="Arial" w:hAnsi="Arial"/>
                 <w:b w:val="false"/>
                 <w:bCs w:val="false"/>
-                <w:sz w:val="17"/>
-                <w:szCs w:val="17"/>
+                <w:sz w:val="16"/>
+                <w:szCs w:val="16"/>
               </w:rPr>
               <w:t xml:space="preserve">Fim da planilha paralela e menos erro.</w:t>
             </w:r>
@@ -7800,8 +7794,8 @@
                 <w:rFonts w:ascii="Arial" w:cs="Arial" w:eastAsia="Arial" w:hAnsi="Arial"/>
                 <w:b/>
                 <w:bCs/>
-                <w:sz w:val="17"/>
-                <w:szCs w:val="17"/>
+                <w:sz w:val="16"/>
+                <w:szCs w:val="16"/>
               </w:rPr>
               <w:t xml:space="preserve">Ocorrências abertas na medição</w:t>
             </w:r>
@@ -7833,8 +7827,8 @@
                 <w:rFonts w:ascii="Arial" w:cs="Arial" w:eastAsia="Arial" w:hAnsi="Arial"/>
                 <w:b w:val="false"/>
                 <w:bCs w:val="false"/>
-                <w:sz w:val="17"/>
-                <w:szCs w:val="17"/>
+                <w:sz w:val="16"/>
+                <w:szCs w:val="16"/>
               </w:rPr>
               <w:t xml:space="preserve">Só ocorrências finalizadas entram; as abertas somem da análise.</w:t>
             </w:r>
@@ -7866,8 +7860,8 @@
                 <w:rFonts w:ascii="Arial" w:cs="Arial" w:eastAsia="Arial" w:hAnsi="Arial"/>
                 <w:b w:val="false"/>
                 <w:bCs w:val="false"/>
-                <w:sz w:val="17"/>
-                <w:szCs w:val="17"/>
+                <w:sz w:val="16"/>
+                <w:szCs w:val="16"/>
               </w:rPr>
               <w:t xml:space="preserve">Só as finalizadas pontuam, mas as abertas aparecem em lista no fechamento (V18).</w:t>
             </w:r>
@@ -7899,8 +7893,8 @@
                 <w:rFonts w:ascii="Arial" w:cs="Arial" w:eastAsia="Arial" w:hAnsi="Arial"/>
                 <w:b w:val="false"/>
                 <w:bCs w:val="false"/>
-                <w:sz w:val="17"/>
-                <w:szCs w:val="17"/>
+                <w:sz w:val="16"/>
+                <w:szCs w:val="16"/>
               </w:rPr>
               <w:t xml:space="preserve">Decisão com visão completa.</w:t>
             </w:r>
@@ -7937,8 +7931,8 @@
                 <w:rFonts w:ascii="Arial" w:cs="Arial" w:eastAsia="Arial" w:hAnsi="Arial"/>
                 <w:b/>
                 <w:bCs/>
-                <w:sz w:val="17"/>
-                <w:szCs w:val="17"/>
+                <w:sz w:val="16"/>
+                <w:szCs w:val="16"/>
               </w:rPr>
               <w:t xml:space="preserve">Comparação entre fornecedores</w:t>
             </w:r>
@@ -7969,8 +7963,8 @@
                 <w:rFonts w:ascii="Arial" w:cs="Arial" w:eastAsia="Arial" w:hAnsi="Arial"/>
                 <w:b w:val="false"/>
                 <w:bCs w:val="false"/>
-                <w:sz w:val="17"/>
-                <w:szCs w:val="17"/>
+                <w:sz w:val="16"/>
+                <w:szCs w:val="16"/>
               </w:rPr>
               <w:t xml:space="preserve">Baseada no volume total de ocorrências.</w:t>
             </w:r>
@@ -8001,8 +7995,8 @@
                 <w:rFonts w:ascii="Arial" w:cs="Arial" w:eastAsia="Arial" w:hAnsi="Arial"/>
                 <w:b w:val="false"/>
                 <w:bCs w:val="false"/>
-                <w:sz w:val="17"/>
-                <w:szCs w:val="17"/>
+                <w:sz w:val="16"/>
+                <w:szCs w:val="16"/>
               </w:rPr>
               <w:t xml:space="preserve">Também por posto, efetivo e criticidade (V19).</w:t>
             </w:r>
@@ -8033,8 +8027,8 @@
                 <w:rFonts w:ascii="Arial" w:cs="Arial" w:eastAsia="Arial" w:hAnsi="Arial"/>
                 <w:b w:val="false"/>
                 <w:bCs w:val="false"/>
-                <w:sz w:val="17"/>
-                <w:szCs w:val="17"/>
+                <w:sz w:val="16"/>
+                <w:szCs w:val="16"/>
               </w:rPr>
               <w:t xml:space="preserve">Comparação mais justa.</w:t>
             </w:r>
@@ -8071,8 +8065,8 @@
                 <w:rFonts w:ascii="Arial" w:cs="Arial" w:eastAsia="Arial" w:hAnsi="Arial"/>
                 <w:b/>
                 <w:bCs/>
-                <w:sz w:val="17"/>
-                <w:szCs w:val="17"/>
+                <w:sz w:val="16"/>
+                <w:szCs w:val="16"/>
               </w:rPr>
               <w:t xml:space="preserve">Controles paralelos</w:t>
             </w:r>
@@ -8104,8 +8098,8 @@
                 <w:rFonts w:ascii="Arial" w:cs="Arial" w:eastAsia="Arial" w:hAnsi="Arial"/>
                 <w:b w:val="false"/>
                 <w:bCs w:val="false"/>
-                <w:sz w:val="17"/>
-                <w:szCs w:val="17"/>
+                <w:sz w:val="16"/>
+                <w:szCs w:val="16"/>
               </w:rPr>
               <w:t xml:space="preserve">E-mail, Excel e filas próprias.</w:t>
             </w:r>
@@ -8137,8 +8131,8 @@
                 <w:rFonts w:ascii="Arial" w:cs="Arial" w:eastAsia="Arial" w:hAnsi="Arial"/>
                 <w:b w:val="false"/>
                 <w:bCs w:val="false"/>
-                <w:sz w:val="17"/>
-                <w:szCs w:val="17"/>
+                <w:sz w:val="16"/>
+                <w:szCs w:val="16"/>
               </w:rPr>
               <w:t xml:space="preserve">Tudo no sistema: notificação, pendência e histórico.</w:t>
             </w:r>
@@ -8170,8 +8164,8 @@
                 <w:rFonts w:ascii="Arial" w:cs="Arial" w:eastAsia="Arial" w:hAnsi="Arial"/>
                 <w:b w:val="false"/>
                 <w:bCs w:val="false"/>
-                <w:sz w:val="17"/>
-                <w:szCs w:val="17"/>
+                <w:sz w:val="16"/>
+                <w:szCs w:val="16"/>
               </w:rPr>
               <w:t xml:space="preserve">Uma única fonte de verdade.</w:t>
             </w:r>
@@ -8208,8 +8202,8 @@
                 <w:rFonts w:ascii="Arial" w:cs="Arial" w:eastAsia="Arial" w:hAnsi="Arial"/>
                 <w:b/>
                 <w:bCs/>
-                <w:sz w:val="17"/>
-                <w:szCs w:val="17"/>
+                <w:sz w:val="16"/>
+                <w:szCs w:val="16"/>
               </w:rPr>
               <w:t xml:space="preserve">Dados pessoais de terceiros</w:t>
             </w:r>
@@ -8240,8 +8234,8 @@
                 <w:rFonts w:ascii="Arial" w:cs="Arial" w:eastAsia="Arial" w:hAnsi="Arial"/>
                 <w:b w:val="false"/>
                 <w:bCs w:val="false"/>
-                <w:sz w:val="17"/>
-                <w:szCs w:val="17"/>
+                <w:sz w:val="16"/>
+                <w:szCs w:val="16"/>
               </w:rPr>
               <w:t xml:space="preserve">Ficam no campo livre de observação.</w:t>
             </w:r>
@@ -8272,8 +8266,8 @@
                 <w:rFonts w:ascii="Arial" w:cs="Arial" w:eastAsia="Arial" w:hAnsi="Arial"/>
                 <w:b w:val="false"/>
                 <w:bCs w:val="false"/>
-                <w:sz w:val="17"/>
-                <w:szCs w:val="17"/>
+                <w:sz w:val="16"/>
+                <w:szCs w:val="16"/>
               </w:rPr>
               <w:t xml:space="preserve">Campos próprios e protegidos, com o mínimo necessário (V12).</w:t>
             </w:r>
@@ -8304,8 +8298,8 @@
                 <w:rFonts w:ascii="Arial" w:cs="Arial" w:eastAsia="Arial" w:hAnsi="Arial"/>
                 <w:b w:val="false"/>
                 <w:bCs w:val="false"/>
-                <w:sz w:val="17"/>
-                <w:szCs w:val="17"/>
+                <w:sz w:val="16"/>
+                <w:szCs w:val="16"/>
               </w:rPr>
               <w:t xml:space="preserve">Aderência à LGPD.</w:t>
             </w:r>
@@ -8342,8 +8336,8 @@
                 <w:rFonts w:ascii="Arial" w:cs="Arial" w:eastAsia="Arial" w:hAnsi="Arial"/>
                 <w:b/>
                 <w:bCs/>
-                <w:sz w:val="17"/>
-                <w:szCs w:val="17"/>
+                <w:sz w:val="16"/>
+                <w:szCs w:val="16"/>
               </w:rPr>
               <w:t xml:space="preserve">Sustentação</w:t>
             </w:r>
@@ -8375,8 +8369,8 @@
                 <w:rFonts w:ascii="Arial" w:cs="Arial" w:eastAsia="Arial" w:hAnsi="Arial"/>
                 <w:b w:val="false"/>
                 <w:bCs w:val="false"/>
-                <w:sz w:val="17"/>
-                <w:szCs w:val="17"/>
+                <w:sz w:val="16"/>
+                <w:szCs w:val="16"/>
               </w:rPr>
               <w:t xml:space="preserve">Funções deixaram de funcionar por falta de manutenção.</w:t>
             </w:r>
@@ -8408,8 +8402,8 @@
                 <w:rFonts w:ascii="Arial" w:cs="Arial" w:eastAsia="Arial" w:hAnsi="Arial"/>
                 <w:b w:val="false"/>
                 <w:bCs w:val="false"/>
-                <w:sz w:val="17"/>
-                <w:szCs w:val="17"/>
+                <w:sz w:val="16"/>
+                <w:szCs w:val="16"/>
               </w:rPr>
               <w:t xml:space="preserve">Sustentação com responsável, canal e prazos acordados (V22).</w:t>
             </w:r>
@@ -8441,8 +8435,8 @@
                 <w:rFonts w:ascii="Arial" w:cs="Arial" w:eastAsia="Arial" w:hAnsi="Arial"/>
                 <w:b w:val="false"/>
                 <w:bCs w:val="false"/>
-                <w:sz w:val="17"/>
-                <w:szCs w:val="17"/>
+                <w:sz w:val="16"/>
+                <w:szCs w:val="16"/>
               </w:rPr>
               <w:t xml:space="preserve">Sistema mantido e evoluído.</w:t>
             </w:r>
@@ -8459,10 +8453,13 @@
       <w:pPr>
         <w:sectPr>
           <w:headerReference w:type="default" r:id="rId7"/>
-          <w:footerReference w:type="default" r:id="rId8"/>
+          <w:headerReference w:type="first" r:id="rId8"/>
+          <w:footerReference w:type="default" r:id="rId9"/>
+          <w:footerReference w:type="first" r:id="rId10"/>
           <w:pgSz w:w="11906" w:h="16838" w:orient="portrait"/>
           <w:pgMar w:top="1300" w:right="1134" w:bottom="1134" w:left="1134" w:header="708" w:footer="708" w:gutter="0"/>
           <w:pgNumType/>
+          <w:titlePg/>
           <w:docGrid w:linePitch="360"/>
         </w:sectPr>
       </w:pPr>
@@ -8550,7 +8547,7 @@
                     </pic:cNvPicPr>
                   </pic:nvPicPr>
                   <pic:blipFill>
-                    <a:blip r:embed="rId13" cstate="none"/>
+                    <a:blip r:embed="rId19" cstate="none"/>
                     <a:srcRect/>
                     <a:stretch>
                       <a:fillRect/>
@@ -8613,7 +8610,7 @@
                     </pic:cNvPicPr>
                   </pic:nvPicPr>
                   <pic:blipFill>
-                    <a:blip r:embed="rId14" cstate="none"/>
+                    <a:blip r:embed="rId20" cstate="none"/>
                     <a:srcRect/>
                     <a:stretch>
                       <a:fillRect/>
@@ -8665,7 +8662,7 @@
       <w:r>
         <w:drawing>
           <wp:inline distT="0" distB="0" distL="0" distR="0">
-            <wp:extent cx="4762500" cy="3981450"/>
+            <wp:extent cx="5905500" cy="4267200"/>
             <wp:effectExtent t="0" r="0" b="0" l="0"/>
             <wp:docPr id="1" name="fig" descr="Figura do documento" title="Figura"/>
             <wp:cNvGraphicFramePr>
@@ -8681,7 +8678,7 @@
                     </pic:cNvPicPr>
                   </pic:nvPicPr>
                   <pic:blipFill>
-                    <a:blip r:embed="rId15" cstate="none"/>
+                    <a:blip r:embed="rId21" cstate="none"/>
                     <a:srcRect/>
                     <a:stretch>
                       <a:fillRect/>
@@ -8690,7 +8687,7 @@
                   <pic:spPr bwMode="auto">
                     <a:xfrm>
                       <a:off x="0" y="0"/>
-                      <a:ext cx="4762500" cy="3981450"/>
+                      <a:ext cx="5905500" cy="4267200"/>
                     </a:xfrm>
                     <a:prstGeom prst="rect">
                       <a:avLst/>
@@ -8746,7 +8743,7 @@
       <w:r>
         <w:drawing>
           <wp:inline distT="0" distB="0" distL="0" distR="0">
-            <wp:extent cx="8382000" cy="5915025"/>
+            <wp:extent cx="9144000" cy="5486400"/>
             <wp:effectExtent t="0" r="0" b="0" l="0"/>
             <wp:docPr id="1" name="fig" descr="Figura do documento" title="Figura"/>
             <wp:cNvGraphicFramePr>
@@ -8762,7 +8759,7 @@
                     </pic:cNvPicPr>
                   </pic:nvPicPr>
                   <pic:blipFill>
-                    <a:blip r:embed="rId16" cstate="none"/>
+                    <a:blip r:embed="rId22" cstate="none"/>
                     <a:srcRect/>
                     <a:stretch>
                       <a:fillRect/>
@@ -8771,7 +8768,7 @@
                   <pic:spPr bwMode="auto">
                     <a:xfrm>
                       <a:off x="0" y="0"/>
-                      <a:ext cx="8382000" cy="5915025"/>
+                      <a:ext cx="9144000" cy="5486400"/>
                     </a:xfrm>
                     <a:prstGeom prst="rect">
                       <a:avLst/>
@@ -8814,7 +8811,7 @@
       <w:r>
         <w:drawing>
           <wp:inline distT="0" distB="0" distL="0" distR="0">
-            <wp:extent cx="8001000" cy="5857875"/>
+            <wp:extent cx="8953500" cy="5581650"/>
             <wp:effectExtent t="0" r="0" b="0" l="0"/>
             <wp:docPr id="1" name="fig" descr="Figura do documento" title="Figura"/>
             <wp:cNvGraphicFramePr>
@@ -8830,7 +8827,7 @@
                     </pic:cNvPicPr>
                   </pic:nvPicPr>
                   <pic:blipFill>
-                    <a:blip r:embed="rId17" cstate="none"/>
+                    <a:blip r:embed="rId23" cstate="none"/>
                     <a:srcRect/>
                     <a:stretch>
                       <a:fillRect/>
@@ -8839,7 +8836,7 @@
                   <pic:spPr bwMode="auto">
                     <a:xfrm>
                       <a:off x="0" y="0"/>
-                      <a:ext cx="8001000" cy="5857875"/>
+                      <a:ext cx="8953500" cy="5581650"/>
                     </a:xfrm>
                     <a:prstGeom prst="rect">
                       <a:avLst/>
@@ -8882,7 +8879,7 @@
       <w:r>
         <w:drawing>
           <wp:inline distT="0" distB="0" distL="0" distR="0">
-            <wp:extent cx="8572500" cy="2857500"/>
+            <wp:extent cx="9334500" cy="2705100"/>
             <wp:effectExtent t="0" r="0" b="0" l="0"/>
             <wp:docPr id="1" name="fig" descr="Figura do documento" title="Figura"/>
             <wp:cNvGraphicFramePr>
@@ -8898,7 +8895,7 @@
                     </pic:cNvPicPr>
                   </pic:nvPicPr>
                   <pic:blipFill>
-                    <a:blip r:embed="rId18" cstate="none"/>
+                    <a:blip r:embed="rId24" cstate="none"/>
                     <a:srcRect/>
                     <a:stretch>
                       <a:fillRect/>
@@ -8907,7 +8904,7 @@
                   <pic:spPr bwMode="auto">
                     <a:xfrm>
                       <a:off x="0" y="0"/>
-                      <a:ext cx="8572500" cy="2857500"/>
+                      <a:ext cx="9334500" cy="2705100"/>
                     </a:xfrm>
                     <a:prstGeom prst="rect">
                       <a:avLst/>
@@ -9702,8 +9699,10 @@
     <w:p>
       <w:pPr>
         <w:sectPr>
-          <w:headerReference w:type="default" r:id="rId9"/>
-          <w:footerReference w:type="default" r:id="rId10"/>
+          <w:headerReference w:type="default" r:id="rId11"/>
+          <w:headerReference w:type="first" r:id="rId12"/>
+          <w:footerReference w:type="default" r:id="rId13"/>
+          <w:footerReference w:type="first" r:id="rId14"/>
           <w:pgSz w:w="16838" w:h="11906" w:orient="landscape"/>
           <w:pgMar w:top="1100" w:right="850" w:bottom="900" w:left="850" w:header="708" w:footer="708" w:gutter="0"/>
           <w:pgNumType/>
@@ -39595,8 +39594,10 @@
       </w:tr>
     </w:tbl>
     <w:sectPr>
-      <w:headerReference w:type="default" r:id="rId11"/>
-      <w:footerReference w:type="default" r:id="rId12"/>
+      <w:headerReference w:type="default" r:id="rId15"/>
+      <w:headerReference w:type="first" r:id="rId16"/>
+      <w:footerReference w:type="default" r:id="rId17"/>
+      <w:footerReference w:type="first" r:id="rId18"/>
       <w:pgSz w:w="11906" w:h="16838" w:orient="portrait"/>
       <w:pgMar w:top="1300" w:right="1134" w:bottom="1134" w:left="1134" w:header="708" w:footer="708" w:gutter="0"/>
       <w:pgNumType/>
@@ -39672,11 +39673,35 @@
         <w:szCs w:val="16"/>
       </w:rPr>
       <w:t xml:space="preserve">	Página </w:t>
+    </w:r>
+    <w:r>
+      <w:rPr>
+        <w:rFonts w:ascii="Arial" w:cs="Arial" w:eastAsia="Arial" w:hAnsi="Arial"/>
+        <w:color w:val="666666"/>
+        <w:sz w:val="16"/>
+        <w:szCs w:val="16"/>
+      </w:rPr>
       <w:fldChar w:fldCharType="begin"/>
       <w:instrText xml:space="preserve">PAGE</w:instrText>
       <w:fldChar w:fldCharType="separate"/>
       <w:fldChar w:fldCharType="end"/>
+    </w:r>
+    <w:r>
+      <w:rPr>
+        <w:rFonts w:ascii="Arial" w:cs="Arial" w:eastAsia="Arial" w:hAnsi="Arial"/>
+        <w:color w:val="666666"/>
+        <w:sz w:val="16"/>
+        <w:szCs w:val="16"/>
+      </w:rPr>
       <w:t xml:space="preserve"> de </w:t>
+    </w:r>
+    <w:r>
+      <w:rPr>
+        <w:rFonts w:ascii="Arial" w:cs="Arial" w:eastAsia="Arial" w:hAnsi="Arial"/>
+        <w:color w:val="666666"/>
+        <w:sz w:val="16"/>
+        <w:szCs w:val="16"/>
+      </w:rPr>
       <w:fldChar w:fldCharType="begin"/>
       <w:instrText xml:space="preserve">NUMPAGES</w:instrText>
       <w:fldChar w:fldCharType="separate"/>
@@ -39687,6 +39712,12 @@
 </file>
 
 <file path=word/footer2.xml><?xml version="1.0" encoding="utf-8"?>
+<w:ftr xmlns:wpc="http://schemas.microsoft.com/office/word/2010/wordprocessingCanvas" xmlns:mc="http://schemas.openxmlformats.org/markup-compatibility/2006" xmlns:o="urn:schemas-microsoft-com:office:office" xmlns:r="http://schemas.openxmlformats.org/officeDocument/2006/relationships" xmlns:m="http://schemas.openxmlformats.org/officeDocument/2006/math" xmlns:v="urn:schemas-microsoft-com:vml" xmlns:wp14="http://schemas.microsoft.com/office/word/2010/wordprocessingDrawing" xmlns:wp="http://schemas.openxmlformats.org/drawingml/2006/wordprocessingDrawing" xmlns:w10="urn:schemas-microsoft-com:office:word" xmlns:w="http://schemas.openxmlformats.org/wordprocessingml/2006/main" xmlns:w14="http://schemas.microsoft.com/office/word/2010/wordml" xmlns:w15="http://schemas.microsoft.com/office/word/2012/wordml" xmlns:wpg="http://schemas.microsoft.com/office/word/2010/wordprocessingGroup" xmlns:wpi="http://schemas.microsoft.com/office/word/2010/wordprocessingInk" xmlns:wne="http://schemas.microsoft.com/office/word/2006/wordml" xmlns:wps="http://schemas.microsoft.com/office/word/2010/wordprocessingShape">
+  <w:p/>
+</w:ftr>
+</file>
+
+<file path=word/footer3.xml><?xml version="1.0" encoding="utf-8"?>
 <w:ftr xmlns:wpc="http://schemas.microsoft.com/office/word/2010/wordprocessingCanvas" xmlns:mc="http://schemas.openxmlformats.org/markup-compatibility/2006" xmlns:o="urn:schemas-microsoft-com:office:office" xmlns:r="http://schemas.openxmlformats.org/officeDocument/2006/relationships" xmlns:m="http://schemas.openxmlformats.org/officeDocument/2006/math" xmlns:v="urn:schemas-microsoft-com:vml" xmlns:wp14="http://schemas.microsoft.com/office/word/2010/wordprocessingDrawing" xmlns:wp="http://schemas.openxmlformats.org/drawingml/2006/wordprocessingDrawing" xmlns:w10="urn:schemas-microsoft-com:office:word" xmlns:w="http://schemas.openxmlformats.org/wordprocessingml/2006/main" xmlns:w14="http://schemas.microsoft.com/office/word/2010/wordml" xmlns:w15="http://schemas.microsoft.com/office/word/2012/wordml" xmlns:wpg="http://schemas.microsoft.com/office/word/2010/wordprocessingGroup" xmlns:wpi="http://schemas.microsoft.com/office/word/2010/wordprocessingInk" xmlns:wne="http://schemas.microsoft.com/office/word/2006/wordml" xmlns:wps="http://schemas.microsoft.com/office/word/2010/wordprocessingShape">
   <w:p>
     <w:pPr>
@@ -39711,11 +39742,35 @@
         <w:szCs w:val="16"/>
       </w:rPr>
       <w:t xml:space="preserve">	Página </w:t>
+    </w:r>
+    <w:r>
+      <w:rPr>
+        <w:rFonts w:ascii="Arial" w:cs="Arial" w:eastAsia="Arial" w:hAnsi="Arial"/>
+        <w:color w:val="666666"/>
+        <w:sz w:val="16"/>
+        <w:szCs w:val="16"/>
+      </w:rPr>
       <w:fldChar w:fldCharType="begin"/>
       <w:instrText xml:space="preserve">PAGE</w:instrText>
       <w:fldChar w:fldCharType="separate"/>
       <w:fldChar w:fldCharType="end"/>
+    </w:r>
+    <w:r>
+      <w:rPr>
+        <w:rFonts w:ascii="Arial" w:cs="Arial" w:eastAsia="Arial" w:hAnsi="Arial"/>
+        <w:color w:val="666666"/>
+        <w:sz w:val="16"/>
+        <w:szCs w:val="16"/>
+      </w:rPr>
       <w:t xml:space="preserve"> de </w:t>
+    </w:r>
+    <w:r>
+      <w:rPr>
+        <w:rFonts w:ascii="Arial" w:cs="Arial" w:eastAsia="Arial" w:hAnsi="Arial"/>
+        <w:color w:val="666666"/>
+        <w:sz w:val="16"/>
+        <w:szCs w:val="16"/>
+      </w:rPr>
       <w:fldChar w:fldCharType="begin"/>
       <w:instrText xml:space="preserve">NUMPAGES</w:instrText>
       <w:fldChar w:fldCharType="separate"/>
@@ -39725,7 +39780,13 @@
 </w:ftr>
 </file>
 
-<file path=word/footer3.xml><?xml version="1.0" encoding="utf-8"?>
+<file path=word/footer4.xml><?xml version="1.0" encoding="utf-8"?>
+<w:ftr xmlns:wpc="http://schemas.microsoft.com/office/word/2010/wordprocessingCanvas" xmlns:mc="http://schemas.openxmlformats.org/markup-compatibility/2006" xmlns:o="urn:schemas-microsoft-com:office:office" xmlns:r="http://schemas.openxmlformats.org/officeDocument/2006/relationships" xmlns:m="http://schemas.openxmlformats.org/officeDocument/2006/math" xmlns:v="urn:schemas-microsoft-com:vml" xmlns:wp14="http://schemas.microsoft.com/office/word/2010/wordprocessingDrawing" xmlns:wp="http://schemas.openxmlformats.org/drawingml/2006/wordprocessingDrawing" xmlns:w10="urn:schemas-microsoft-com:office:word" xmlns:w="http://schemas.openxmlformats.org/wordprocessingml/2006/main" xmlns:w14="http://schemas.microsoft.com/office/word/2010/wordml" xmlns:w15="http://schemas.microsoft.com/office/word/2012/wordml" xmlns:wpg="http://schemas.microsoft.com/office/word/2010/wordprocessingGroup" xmlns:wpi="http://schemas.microsoft.com/office/word/2010/wordprocessingInk" xmlns:wne="http://schemas.microsoft.com/office/word/2006/wordml" xmlns:wps="http://schemas.microsoft.com/office/word/2010/wordprocessingShape">
+  <w:p/>
+</w:ftr>
+</file>
+
+<file path=word/footer5.xml><?xml version="1.0" encoding="utf-8"?>
 <w:ftr xmlns:wpc="http://schemas.microsoft.com/office/word/2010/wordprocessingCanvas" xmlns:mc="http://schemas.openxmlformats.org/markup-compatibility/2006" xmlns:o="urn:schemas-microsoft-com:office:office" xmlns:r="http://schemas.openxmlformats.org/officeDocument/2006/relationships" xmlns:m="http://schemas.openxmlformats.org/officeDocument/2006/math" xmlns:v="urn:schemas-microsoft-com:vml" xmlns:wp14="http://schemas.microsoft.com/office/word/2010/wordprocessingDrawing" xmlns:wp="http://schemas.openxmlformats.org/drawingml/2006/wordprocessingDrawing" xmlns:w10="urn:schemas-microsoft-com:office:word" xmlns:w="http://schemas.openxmlformats.org/wordprocessingml/2006/main" xmlns:w14="http://schemas.microsoft.com/office/word/2010/wordml" xmlns:w15="http://schemas.microsoft.com/office/word/2012/wordml" xmlns:wpg="http://schemas.microsoft.com/office/word/2010/wordprocessingGroup" xmlns:wpi="http://schemas.microsoft.com/office/word/2010/wordprocessingInk" xmlns:wne="http://schemas.microsoft.com/office/word/2006/wordml" xmlns:wps="http://schemas.microsoft.com/office/word/2010/wordprocessingShape">
   <w:p>
     <w:pPr>
@@ -39750,17 +39811,47 @@
         <w:szCs w:val="16"/>
       </w:rPr>
       <w:t xml:space="preserve">	Página </w:t>
+    </w:r>
+    <w:r>
+      <w:rPr>
+        <w:rFonts w:ascii="Arial" w:cs="Arial" w:eastAsia="Arial" w:hAnsi="Arial"/>
+        <w:color w:val="666666"/>
+        <w:sz w:val="16"/>
+        <w:szCs w:val="16"/>
+      </w:rPr>
       <w:fldChar w:fldCharType="begin"/>
       <w:instrText xml:space="preserve">PAGE</w:instrText>
       <w:fldChar w:fldCharType="separate"/>
       <w:fldChar w:fldCharType="end"/>
+    </w:r>
+    <w:r>
+      <w:rPr>
+        <w:rFonts w:ascii="Arial" w:cs="Arial" w:eastAsia="Arial" w:hAnsi="Arial"/>
+        <w:color w:val="666666"/>
+        <w:sz w:val="16"/>
+        <w:szCs w:val="16"/>
+      </w:rPr>
       <w:t xml:space="preserve"> de </w:t>
+    </w:r>
+    <w:r>
+      <w:rPr>
+        <w:rFonts w:ascii="Arial" w:cs="Arial" w:eastAsia="Arial" w:hAnsi="Arial"/>
+        <w:color w:val="666666"/>
+        <w:sz w:val="16"/>
+        <w:szCs w:val="16"/>
+      </w:rPr>
       <w:fldChar w:fldCharType="begin"/>
       <w:instrText xml:space="preserve">NUMPAGES</w:instrText>
       <w:fldChar w:fldCharType="separate"/>
       <w:fldChar w:fldCharType="end"/>
     </w:r>
   </w:p>
+</w:ftr>
+</file>
+
+<file path=word/footer6.xml><?xml version="1.0" encoding="utf-8"?>
+<w:ftr xmlns:wpc="http://schemas.microsoft.com/office/word/2010/wordprocessingCanvas" xmlns:mc="http://schemas.openxmlformats.org/markup-compatibility/2006" xmlns:o="urn:schemas-microsoft-com:office:office" xmlns:r="http://schemas.openxmlformats.org/officeDocument/2006/relationships" xmlns:m="http://schemas.openxmlformats.org/officeDocument/2006/math" xmlns:v="urn:schemas-microsoft-com:vml" xmlns:wp14="http://schemas.microsoft.com/office/word/2010/wordprocessingDrawing" xmlns:wp="http://schemas.openxmlformats.org/drawingml/2006/wordprocessingDrawing" xmlns:w10="urn:schemas-microsoft-com:office:word" xmlns:w="http://schemas.openxmlformats.org/wordprocessingml/2006/main" xmlns:w14="http://schemas.microsoft.com/office/word/2010/wordml" xmlns:w15="http://schemas.microsoft.com/office/word/2012/wordml" xmlns:wpg="http://schemas.microsoft.com/office/word/2010/wordprocessingGroup" xmlns:wpi="http://schemas.microsoft.com/office/word/2010/wordprocessingInk" xmlns:wne="http://schemas.microsoft.com/office/word/2006/wordml" xmlns:wps="http://schemas.microsoft.com/office/word/2010/wordprocessingShape">
+  <w:p/>
 </w:ftr>
 </file>
 
@@ -39838,6 +39929,12 @@
 
 <file path=word/header2.xml><?xml version="1.0" encoding="utf-8"?>
 <w:hdr xmlns:wpc="http://schemas.microsoft.com/office/word/2010/wordprocessingCanvas" xmlns:mc="http://schemas.openxmlformats.org/markup-compatibility/2006" xmlns:o="urn:schemas-microsoft-com:office:office" xmlns:r="http://schemas.openxmlformats.org/officeDocument/2006/relationships" xmlns:m="http://schemas.openxmlformats.org/officeDocument/2006/math" xmlns:v="urn:schemas-microsoft-com:vml" xmlns:wp14="http://schemas.microsoft.com/office/word/2010/wordprocessingDrawing" xmlns:wp="http://schemas.openxmlformats.org/drawingml/2006/wordprocessingDrawing" xmlns:w10="urn:schemas-microsoft-com:office:word" xmlns:w="http://schemas.openxmlformats.org/wordprocessingml/2006/main" xmlns:w14="http://schemas.microsoft.com/office/word/2010/wordml" xmlns:w15="http://schemas.microsoft.com/office/word/2012/wordml" xmlns:wpg="http://schemas.microsoft.com/office/word/2010/wordprocessingGroup" xmlns:wpi="http://schemas.microsoft.com/office/word/2010/wordprocessingInk" xmlns:wne="http://schemas.microsoft.com/office/word/2006/wordml" xmlns:wps="http://schemas.microsoft.com/office/word/2010/wordprocessingShape" xmlns:cx="http://schemas.microsoft.com/office/drawing/2014/chartex" xmlns:cx1="http://schemas.microsoft.com/office/drawing/2015/9/8/chartex" xmlns:cx2="http://schemas.microsoft.com/office/drawing/2015/10/21/chartex" xmlns:cx3="http://schemas.microsoft.com/office/drawing/2016/5/9/chartex" xmlns:cx4="http://schemas.microsoft.com/office/drawing/2016/5/10/chartex" xmlns:cx5="http://schemas.microsoft.com/office/drawing/2016/5/11/chartex" xmlns:cx6="http://schemas.microsoft.com/office/drawing/2016/5/12/chartex" xmlns:cx7="http://schemas.microsoft.com/office/drawing/2016/5/13/chartex" xmlns:cx8="http://schemas.microsoft.com/office/drawing/2016/5/14/chartex" xmlns:w16cid="http://schemas.microsoft.com/office/word/2016/wordml/cid" xmlns:w16se="http://schemas.microsoft.com/office/word/2015/wordml/symex">
+  <w:p/>
+</w:hdr>
+</file>
+
+<file path=word/header3.xml><?xml version="1.0" encoding="utf-8"?>
+<w:hdr xmlns:wpc="http://schemas.microsoft.com/office/word/2010/wordprocessingCanvas" xmlns:mc="http://schemas.openxmlformats.org/markup-compatibility/2006" xmlns:o="urn:schemas-microsoft-com:office:office" xmlns:r="http://schemas.openxmlformats.org/officeDocument/2006/relationships" xmlns:m="http://schemas.openxmlformats.org/officeDocument/2006/math" xmlns:v="urn:schemas-microsoft-com:vml" xmlns:wp14="http://schemas.microsoft.com/office/word/2010/wordprocessingDrawing" xmlns:wp="http://schemas.openxmlformats.org/drawingml/2006/wordprocessingDrawing" xmlns:w10="urn:schemas-microsoft-com:office:word" xmlns:w="http://schemas.openxmlformats.org/wordprocessingml/2006/main" xmlns:w14="http://schemas.microsoft.com/office/word/2010/wordml" xmlns:w15="http://schemas.microsoft.com/office/word/2012/wordml" xmlns:wpg="http://schemas.microsoft.com/office/word/2010/wordprocessingGroup" xmlns:wpi="http://schemas.microsoft.com/office/word/2010/wordprocessingInk" xmlns:wne="http://schemas.microsoft.com/office/word/2006/wordml" xmlns:wps="http://schemas.microsoft.com/office/word/2010/wordprocessingShape" xmlns:cx="http://schemas.microsoft.com/office/drawing/2014/chartex" xmlns:cx1="http://schemas.microsoft.com/office/drawing/2015/9/8/chartex" xmlns:cx2="http://schemas.microsoft.com/office/drawing/2015/10/21/chartex" xmlns:cx3="http://schemas.microsoft.com/office/drawing/2016/5/9/chartex" xmlns:cx4="http://schemas.microsoft.com/office/drawing/2016/5/10/chartex" xmlns:cx5="http://schemas.microsoft.com/office/drawing/2016/5/11/chartex" xmlns:cx6="http://schemas.microsoft.com/office/drawing/2016/5/12/chartex" xmlns:cx7="http://schemas.microsoft.com/office/drawing/2016/5/13/chartex" xmlns:cx8="http://schemas.microsoft.com/office/drawing/2016/5/14/chartex" xmlns:w16cid="http://schemas.microsoft.com/office/word/2016/wordml/cid" xmlns:w16se="http://schemas.microsoft.com/office/word/2015/wordml/symex">
   <w:p>
     <w:pPr>
       <w:pBdr>
@@ -39871,7 +39968,13 @@
 </w:hdr>
 </file>
 
-<file path=word/header3.xml><?xml version="1.0" encoding="utf-8"?>
+<file path=word/header4.xml><?xml version="1.0" encoding="utf-8"?>
+<w:hdr xmlns:wpc="http://schemas.microsoft.com/office/word/2010/wordprocessingCanvas" xmlns:mc="http://schemas.openxmlformats.org/markup-compatibility/2006" xmlns:o="urn:schemas-microsoft-com:office:office" xmlns:r="http://schemas.openxmlformats.org/officeDocument/2006/relationships" xmlns:m="http://schemas.openxmlformats.org/officeDocument/2006/math" xmlns:v="urn:schemas-microsoft-com:vml" xmlns:wp14="http://schemas.microsoft.com/office/word/2010/wordprocessingDrawing" xmlns:wp="http://schemas.openxmlformats.org/drawingml/2006/wordprocessingDrawing" xmlns:w10="urn:schemas-microsoft-com:office:word" xmlns:w="http://schemas.openxmlformats.org/wordprocessingml/2006/main" xmlns:w14="http://schemas.microsoft.com/office/word/2010/wordml" xmlns:w15="http://schemas.microsoft.com/office/word/2012/wordml" xmlns:wpg="http://schemas.microsoft.com/office/word/2010/wordprocessingGroup" xmlns:wpi="http://schemas.microsoft.com/office/word/2010/wordprocessingInk" xmlns:wne="http://schemas.microsoft.com/office/word/2006/wordml" xmlns:wps="http://schemas.microsoft.com/office/word/2010/wordprocessingShape" xmlns:cx="http://schemas.microsoft.com/office/drawing/2014/chartex" xmlns:cx1="http://schemas.microsoft.com/office/drawing/2015/9/8/chartex" xmlns:cx2="http://schemas.microsoft.com/office/drawing/2015/10/21/chartex" xmlns:cx3="http://schemas.microsoft.com/office/drawing/2016/5/9/chartex" xmlns:cx4="http://schemas.microsoft.com/office/drawing/2016/5/10/chartex" xmlns:cx5="http://schemas.microsoft.com/office/drawing/2016/5/11/chartex" xmlns:cx6="http://schemas.microsoft.com/office/drawing/2016/5/12/chartex" xmlns:cx7="http://schemas.microsoft.com/office/drawing/2016/5/13/chartex" xmlns:cx8="http://schemas.microsoft.com/office/drawing/2016/5/14/chartex" xmlns:w16cid="http://schemas.microsoft.com/office/word/2016/wordml/cid" xmlns:w16se="http://schemas.microsoft.com/office/word/2015/wordml/symex">
+  <w:p/>
+</w:hdr>
+</file>
+
+<file path=word/header5.xml><?xml version="1.0" encoding="utf-8"?>
 <w:hdr xmlns:wpc="http://schemas.microsoft.com/office/word/2010/wordprocessingCanvas" xmlns:mc="http://schemas.openxmlformats.org/markup-compatibility/2006" xmlns:o="urn:schemas-microsoft-com:office:office" xmlns:r="http://schemas.openxmlformats.org/officeDocument/2006/relationships" xmlns:m="http://schemas.openxmlformats.org/officeDocument/2006/math" xmlns:v="urn:schemas-microsoft-com:vml" xmlns:wp14="http://schemas.microsoft.com/office/word/2010/wordprocessingDrawing" xmlns:wp="http://schemas.openxmlformats.org/drawingml/2006/wordprocessingDrawing" xmlns:w10="urn:schemas-microsoft-com:office:word" xmlns:w="http://schemas.openxmlformats.org/wordprocessingml/2006/main" xmlns:w14="http://schemas.microsoft.com/office/word/2010/wordml" xmlns:w15="http://schemas.microsoft.com/office/word/2012/wordml" xmlns:wpg="http://schemas.microsoft.com/office/word/2010/wordprocessingGroup" xmlns:wpi="http://schemas.microsoft.com/office/word/2010/wordprocessingInk" xmlns:wne="http://schemas.microsoft.com/office/word/2006/wordml" xmlns:wps="http://schemas.microsoft.com/office/word/2010/wordprocessingShape" xmlns:cx="http://schemas.microsoft.com/office/drawing/2014/chartex" xmlns:cx1="http://schemas.microsoft.com/office/drawing/2015/9/8/chartex" xmlns:cx2="http://schemas.microsoft.com/office/drawing/2015/10/21/chartex" xmlns:cx3="http://schemas.microsoft.com/office/drawing/2016/5/9/chartex" xmlns:cx4="http://schemas.microsoft.com/office/drawing/2016/5/10/chartex" xmlns:cx5="http://schemas.microsoft.com/office/drawing/2016/5/11/chartex" xmlns:cx6="http://schemas.microsoft.com/office/drawing/2016/5/12/chartex" xmlns:cx7="http://schemas.microsoft.com/office/drawing/2016/5/13/chartex" xmlns:cx8="http://schemas.microsoft.com/office/drawing/2016/5/14/chartex" xmlns:w16cid="http://schemas.microsoft.com/office/word/2016/wordml/cid" xmlns:w16se="http://schemas.microsoft.com/office/word/2015/wordml/symex">
   <w:p>
     <w:pPr>
@@ -39903,6 +40006,12 @@
       <w:t xml:space="preserve">	Novo Sistema de Gestão e Medição de Serviços (SLA)</w:t>
     </w:r>
   </w:p>
+</w:hdr>
+</file>
+
+<file path=word/header6.xml><?xml version="1.0" encoding="utf-8"?>
+<w:hdr xmlns:wpc="http://schemas.microsoft.com/office/word/2010/wordprocessingCanvas" xmlns:mc="http://schemas.openxmlformats.org/markup-compatibility/2006" xmlns:o="urn:schemas-microsoft-com:office:office" xmlns:r="http://schemas.openxmlformats.org/officeDocument/2006/relationships" xmlns:m="http://schemas.openxmlformats.org/officeDocument/2006/math" xmlns:v="urn:schemas-microsoft-com:vml" xmlns:wp14="http://schemas.microsoft.com/office/word/2010/wordprocessingDrawing" xmlns:wp="http://schemas.openxmlformats.org/drawingml/2006/wordprocessingDrawing" xmlns:w10="urn:schemas-microsoft-com:office:word" xmlns:w="http://schemas.openxmlformats.org/wordprocessingml/2006/main" xmlns:w14="http://schemas.microsoft.com/office/word/2010/wordml" xmlns:w15="http://schemas.microsoft.com/office/word/2012/wordml" xmlns:wpg="http://schemas.microsoft.com/office/word/2010/wordprocessingGroup" xmlns:wpi="http://schemas.microsoft.com/office/word/2010/wordprocessingInk" xmlns:wne="http://schemas.microsoft.com/office/word/2006/wordml" xmlns:wps="http://schemas.microsoft.com/office/word/2010/wordprocessingShape" xmlns:cx="http://schemas.microsoft.com/office/drawing/2014/chartex" xmlns:cx1="http://schemas.microsoft.com/office/drawing/2015/9/8/chartex" xmlns:cx2="http://schemas.microsoft.com/office/drawing/2015/10/21/chartex" xmlns:cx3="http://schemas.microsoft.com/office/drawing/2016/5/9/chartex" xmlns:cx4="http://schemas.microsoft.com/office/drawing/2016/5/10/chartex" xmlns:cx5="http://schemas.microsoft.com/office/drawing/2016/5/11/chartex" xmlns:cx6="http://schemas.microsoft.com/office/drawing/2016/5/12/chartex" xmlns:cx7="http://schemas.microsoft.com/office/drawing/2016/5/13/chartex" xmlns:cx8="http://schemas.microsoft.com/office/drawing/2016/5/14/chartex" xmlns:w16cid="http://schemas.microsoft.com/office/word/2016/wordml/cid" xmlns:w16se="http://schemas.microsoft.com/office/word/2015/wordml/symex">
+  <w:p/>
 </w:hdr>
 </file>
 

</xml_diff>